<commit_message>
add kapital 11 revision
</commit_message>
<xml_diff>
--- a/Grammar Rules.docx
+++ b/Grammar Rules.docx
@@ -101,6 +101,1138 @@
       <w:r>
         <w:t>verspatung haben</w:t>
       </w:r>
+    </w:p>
+    <w:p>
+      <w:pPr>
+        <w:pStyle w:val="ListParagraph"/>
+        <w:numPr>
+          <w:ilvl w:val="0"/>
+          <w:numId w:val="1"/>
+        </w:numPr>
+      </w:pPr>
+      <w:r>
+        <w:t>aber + something + verb</w:t>
+      </w:r>
+    </w:p>
+    <w:p>
+      <w:pPr>
+        <w:pStyle w:val="ListParagraph"/>
+        <w:numPr>
+          <w:ilvl w:val="0"/>
+          <w:numId w:val="1"/>
+        </w:numPr>
+      </w:pPr>
+      <w:r>
+        <w:t>to answer for wohin we answer in the akkusativ so wohin gehst du? Ins fitness studio.But if we make the question wo bist du? Im fitnessstudio</w:t>
+      </w:r>
+    </w:p>
+    <w:p>
+      <w:pPr>
+        <w:pStyle w:val="ListParagraph"/>
+      </w:pPr>
+    </w:p>
+    <w:tbl>
+      <w:tblPr>
+        <w:tblW w:w="0" w:type="auto"/>
+        <w:tblCellSpacing w:w="15" w:type="dxa"/>
+        <w:tblCellMar>
+          <w:top w:w="15" w:type="dxa"/>
+          <w:left w:w="15" w:type="dxa"/>
+          <w:bottom w:w="15" w:type="dxa"/>
+          <w:right w:w="15" w:type="dxa"/>
+        </w:tblCellMar>
+        <w:tblLook w:val="04A0" w:firstRow="1" w:lastRow="0" w:firstColumn="1" w:lastColumn="0" w:noHBand="0" w:noVBand="1"/>
+      </w:tblPr>
+      <w:tblGrid>
+        <w:gridCol w:w="2564"/>
+        <w:gridCol w:w="2091"/>
+        <w:gridCol w:w="2244"/>
+        <w:gridCol w:w="2173"/>
+      </w:tblGrid>
+      <w:tr>
+        <w:trPr>
+          <w:tblCellSpacing w:w="15" w:type="dxa"/>
+        </w:trPr>
+        <w:tc>
+          <w:tcPr>
+            <w:tcW w:w="0" w:type="auto"/>
+            <w:tcBorders>
+              <w:bottom w:val="single" w:sz="4" w:space="0" w:color="363840"/>
+            </w:tcBorders>
+            <w:vAlign w:val="center"/>
+            <w:hideMark/>
+          </w:tcPr>
+          <w:p>
+            <w:pPr>
+              <w:pStyle w:val="ListParagraph"/>
+              <w:rPr>
+                <w:b/>
+                <w:bCs/>
+              </w:rPr>
+            </w:pPr>
+            <w:r>
+              <w:rPr>
+                <w:b/>
+                <w:bCs/>
+              </w:rPr>
+              <w:t>Context / Grammatical Form</w:t>
+            </w:r>
+          </w:p>
+        </w:tc>
+        <w:tc>
+          <w:tcPr>
+            <w:tcW w:w="0" w:type="auto"/>
+            <w:tcBorders>
+              <w:bottom w:val="single" w:sz="4" w:space="0" w:color="363840"/>
+            </w:tcBorders>
+            <w:vAlign w:val="center"/>
+            <w:hideMark/>
+          </w:tcPr>
+          <w:p>
+            <w:pPr>
+              <w:pStyle w:val="ListParagraph"/>
+              <w:rPr>
+                <w:b/>
+                <w:bCs/>
+              </w:rPr>
+            </w:pPr>
+            <w:r>
+              <w:rPr>
+                <w:b/>
+                <w:bCs/>
+              </w:rPr>
+              <w:t>Nominativ (Subject)</w:t>
+            </w:r>
+          </w:p>
+        </w:tc>
+        <w:tc>
+          <w:tcPr>
+            <w:tcW w:w="0" w:type="auto"/>
+            <w:tcBorders>
+              <w:bottom w:val="single" w:sz="4" w:space="0" w:color="363840"/>
+            </w:tcBorders>
+            <w:vAlign w:val="center"/>
+            <w:hideMark/>
+          </w:tcPr>
+          <w:p>
+            <w:pPr>
+              <w:pStyle w:val="ListParagraph"/>
+              <w:rPr>
+                <w:b/>
+                <w:bCs/>
+              </w:rPr>
+            </w:pPr>
+            <w:r>
+              <w:rPr>
+                <w:b/>
+                <w:bCs/>
+              </w:rPr>
+              <w:t>Akkusativ (Direct Object)</w:t>
+            </w:r>
+          </w:p>
+        </w:tc>
+        <w:tc>
+          <w:tcPr>
+            <w:tcW w:w="0" w:type="auto"/>
+            <w:tcBorders>
+              <w:bottom w:val="single" w:sz="4" w:space="0" w:color="363840"/>
+            </w:tcBorders>
+            <w:vAlign w:val="center"/>
+            <w:hideMark/>
+          </w:tcPr>
+          <w:p>
+            <w:pPr>
+              <w:pStyle w:val="ListParagraph"/>
+              <w:rPr>
+                <w:b/>
+                <w:bCs/>
+              </w:rPr>
+            </w:pPr>
+            <w:r>
+              <w:rPr>
+                <w:b/>
+                <w:bCs/>
+              </w:rPr>
+              <w:t>Dativ (Indirect Object)</w:t>
+            </w:r>
+          </w:p>
+        </w:tc>
+      </w:tr>
+      <w:tr>
+        <w:trPr>
+          <w:tblCellSpacing w:w="15" w:type="dxa"/>
+        </w:trPr>
+        <w:tc>
+          <w:tcPr>
+            <w:tcW w:w="0" w:type="auto"/>
+            <w:tcBorders>
+              <w:bottom w:val="single" w:sz="4" w:space="0" w:color="363840"/>
+            </w:tcBorders>
+            <w:vAlign w:val="center"/>
+            <w:hideMark/>
+          </w:tcPr>
+          <w:p>
+            <w:pPr>
+              <w:pStyle w:val="ListParagraph"/>
+            </w:pPr>
+            <w:r>
+              <w:rPr>
+                <w:b/>
+                <w:bCs/>
+              </w:rPr>
+              <w:t>Singular</w:t>
+            </w:r>
+          </w:p>
+        </w:tc>
+        <w:tc>
+          <w:tcPr>
+            <w:tcW w:w="0" w:type="auto"/>
+            <w:tcBorders>
+              <w:bottom w:val="single" w:sz="4" w:space="0" w:color="363840"/>
+            </w:tcBorders>
+            <w:vAlign w:val="center"/>
+            <w:hideMark/>
+          </w:tcPr>
+          <w:p>
+            <w:pPr>
+              <w:pStyle w:val="ListParagraph"/>
+            </w:pPr>
+            <w:r>
+              <w:t xml:space="preserve">ich </w:t>
+            </w:r>
+            <w:r>
+              <w:rPr>
+                <w:i/>
+                <w:iCs/>
+              </w:rPr>
+              <w:t>(I)</w:t>
+            </w:r>
+          </w:p>
+        </w:tc>
+        <w:tc>
+          <w:tcPr>
+            <w:tcW w:w="0" w:type="auto"/>
+            <w:tcBorders>
+              <w:bottom w:val="single" w:sz="4" w:space="0" w:color="363840"/>
+            </w:tcBorders>
+            <w:vAlign w:val="center"/>
+            <w:hideMark/>
+          </w:tcPr>
+          <w:p>
+            <w:pPr>
+              <w:pStyle w:val="ListParagraph"/>
+            </w:pPr>
+            <w:r>
+              <w:t>mich</w:t>
+            </w:r>
+          </w:p>
+        </w:tc>
+        <w:tc>
+          <w:tcPr>
+            <w:tcW w:w="0" w:type="auto"/>
+            <w:tcBorders>
+              <w:bottom w:val="single" w:sz="4" w:space="0" w:color="363840"/>
+            </w:tcBorders>
+            <w:vAlign w:val="center"/>
+            <w:hideMark/>
+          </w:tcPr>
+          <w:p>
+            <w:pPr>
+              <w:pStyle w:val="ListParagraph"/>
+            </w:pPr>
+            <w:r>
+              <w:t>mir</w:t>
+            </w:r>
+          </w:p>
+        </w:tc>
+      </w:tr>
+      <w:tr>
+        <w:trPr>
+          <w:tblCellSpacing w:w="15" w:type="dxa"/>
+        </w:trPr>
+        <w:tc>
+          <w:tcPr>
+            <w:tcW w:w="0" w:type="auto"/>
+            <w:tcBorders>
+              <w:bottom w:val="single" w:sz="4" w:space="0" w:color="363840"/>
+            </w:tcBorders>
+            <w:vAlign w:val="center"/>
+            <w:hideMark/>
+          </w:tcPr>
+          <w:p>
+            <w:pPr>
+              <w:pStyle w:val="ListParagraph"/>
+            </w:pPr>
+            <w:r>
+              <w:rPr>
+                <w:b/>
+                <w:bCs/>
+              </w:rPr>
+              <w:t>Singular</w:t>
+            </w:r>
+          </w:p>
+        </w:tc>
+        <w:tc>
+          <w:tcPr>
+            <w:tcW w:w="0" w:type="auto"/>
+            <w:tcBorders>
+              <w:bottom w:val="single" w:sz="4" w:space="0" w:color="363840"/>
+            </w:tcBorders>
+            <w:vAlign w:val="center"/>
+            <w:hideMark/>
+          </w:tcPr>
+          <w:p>
+            <w:pPr>
+              <w:pStyle w:val="ListParagraph"/>
+            </w:pPr>
+            <w:r>
+              <w:t xml:space="preserve">du </w:t>
+            </w:r>
+            <w:r>
+              <w:rPr>
+                <w:i/>
+                <w:iCs/>
+              </w:rPr>
+              <w:t>(you, informal)</w:t>
+            </w:r>
+          </w:p>
+        </w:tc>
+        <w:tc>
+          <w:tcPr>
+            <w:tcW w:w="0" w:type="auto"/>
+            <w:tcBorders>
+              <w:bottom w:val="single" w:sz="4" w:space="0" w:color="363840"/>
+            </w:tcBorders>
+            <w:vAlign w:val="center"/>
+            <w:hideMark/>
+          </w:tcPr>
+          <w:p>
+            <w:pPr>
+              <w:pStyle w:val="ListParagraph"/>
+            </w:pPr>
+            <w:r>
+              <w:t>dich</w:t>
+            </w:r>
+          </w:p>
+        </w:tc>
+        <w:tc>
+          <w:tcPr>
+            <w:tcW w:w="0" w:type="auto"/>
+            <w:tcBorders>
+              <w:bottom w:val="single" w:sz="4" w:space="0" w:color="363840"/>
+            </w:tcBorders>
+            <w:vAlign w:val="center"/>
+            <w:hideMark/>
+          </w:tcPr>
+          <w:p>
+            <w:pPr>
+              <w:pStyle w:val="ListParagraph"/>
+            </w:pPr>
+            <w:r>
+              <w:t>dir</w:t>
+            </w:r>
+          </w:p>
+        </w:tc>
+      </w:tr>
+      <w:tr>
+        <w:trPr>
+          <w:tblCellSpacing w:w="15" w:type="dxa"/>
+        </w:trPr>
+        <w:tc>
+          <w:tcPr>
+            <w:tcW w:w="0" w:type="auto"/>
+            <w:tcBorders>
+              <w:bottom w:val="single" w:sz="4" w:space="0" w:color="363840"/>
+            </w:tcBorders>
+            <w:vAlign w:val="center"/>
+            <w:hideMark/>
+          </w:tcPr>
+          <w:p>
+            <w:pPr>
+              <w:pStyle w:val="ListParagraph"/>
+            </w:pPr>
+            <w:r>
+              <w:rPr>
+                <w:b/>
+                <w:bCs/>
+              </w:rPr>
+              <w:t>Singular (Masculine)</w:t>
+            </w:r>
+          </w:p>
+        </w:tc>
+        <w:tc>
+          <w:tcPr>
+            <w:tcW w:w="0" w:type="auto"/>
+            <w:tcBorders>
+              <w:bottom w:val="single" w:sz="4" w:space="0" w:color="363840"/>
+            </w:tcBorders>
+            <w:vAlign w:val="center"/>
+            <w:hideMark/>
+          </w:tcPr>
+          <w:p>
+            <w:pPr>
+              <w:pStyle w:val="ListParagraph"/>
+            </w:pPr>
+            <w:r>
+              <w:t xml:space="preserve">er </w:t>
+            </w:r>
+            <w:r>
+              <w:rPr>
+                <w:i/>
+                <w:iCs/>
+              </w:rPr>
+              <w:t>(he)</w:t>
+            </w:r>
+          </w:p>
+        </w:tc>
+        <w:tc>
+          <w:tcPr>
+            <w:tcW w:w="0" w:type="auto"/>
+            <w:tcBorders>
+              <w:bottom w:val="single" w:sz="4" w:space="0" w:color="363840"/>
+            </w:tcBorders>
+            <w:vAlign w:val="center"/>
+            <w:hideMark/>
+          </w:tcPr>
+          <w:p>
+            <w:pPr>
+              <w:pStyle w:val="ListParagraph"/>
+            </w:pPr>
+            <w:r>
+              <w:t>ihn</w:t>
+            </w:r>
+          </w:p>
+        </w:tc>
+        <w:tc>
+          <w:tcPr>
+            <w:tcW w:w="0" w:type="auto"/>
+            <w:tcBorders>
+              <w:bottom w:val="single" w:sz="4" w:space="0" w:color="363840"/>
+            </w:tcBorders>
+            <w:vAlign w:val="center"/>
+            <w:hideMark/>
+          </w:tcPr>
+          <w:p>
+            <w:pPr>
+              <w:pStyle w:val="ListParagraph"/>
+            </w:pPr>
+            <w:r>
+              <w:t>ihm</w:t>
+            </w:r>
+          </w:p>
+        </w:tc>
+      </w:tr>
+      <w:tr>
+        <w:trPr>
+          <w:tblCellSpacing w:w="15" w:type="dxa"/>
+        </w:trPr>
+        <w:tc>
+          <w:tcPr>
+            <w:tcW w:w="0" w:type="auto"/>
+            <w:tcBorders>
+              <w:bottom w:val="single" w:sz="4" w:space="0" w:color="363840"/>
+            </w:tcBorders>
+            <w:vAlign w:val="center"/>
+            <w:hideMark/>
+          </w:tcPr>
+          <w:p>
+            <w:pPr>
+              <w:pStyle w:val="ListParagraph"/>
+            </w:pPr>
+            <w:r>
+              <w:rPr>
+                <w:b/>
+                <w:bCs/>
+              </w:rPr>
+              <w:t>Singular (Feminine)</w:t>
+            </w:r>
+          </w:p>
+        </w:tc>
+        <w:tc>
+          <w:tcPr>
+            <w:tcW w:w="0" w:type="auto"/>
+            <w:tcBorders>
+              <w:bottom w:val="single" w:sz="4" w:space="0" w:color="363840"/>
+            </w:tcBorders>
+            <w:vAlign w:val="center"/>
+            <w:hideMark/>
+          </w:tcPr>
+          <w:p>
+            <w:pPr>
+              <w:pStyle w:val="ListParagraph"/>
+            </w:pPr>
+            <w:r>
+              <w:t xml:space="preserve">sie </w:t>
+            </w:r>
+            <w:r>
+              <w:rPr>
+                <w:i/>
+                <w:iCs/>
+              </w:rPr>
+              <w:t>(she)</w:t>
+            </w:r>
+          </w:p>
+        </w:tc>
+        <w:tc>
+          <w:tcPr>
+            <w:tcW w:w="0" w:type="auto"/>
+            <w:tcBorders>
+              <w:bottom w:val="single" w:sz="4" w:space="0" w:color="363840"/>
+            </w:tcBorders>
+            <w:vAlign w:val="center"/>
+            <w:hideMark/>
+          </w:tcPr>
+          <w:p>
+            <w:pPr>
+              <w:pStyle w:val="ListParagraph"/>
+            </w:pPr>
+            <w:r>
+              <w:t>sie</w:t>
+            </w:r>
+          </w:p>
+        </w:tc>
+        <w:tc>
+          <w:tcPr>
+            <w:tcW w:w="0" w:type="auto"/>
+            <w:tcBorders>
+              <w:bottom w:val="single" w:sz="4" w:space="0" w:color="363840"/>
+            </w:tcBorders>
+            <w:vAlign w:val="center"/>
+            <w:hideMark/>
+          </w:tcPr>
+          <w:p>
+            <w:pPr>
+              <w:pStyle w:val="ListParagraph"/>
+            </w:pPr>
+            <w:r>
+              <w:t>ihr</w:t>
+            </w:r>
+          </w:p>
+        </w:tc>
+      </w:tr>
+      <w:tr>
+        <w:trPr>
+          <w:tblCellSpacing w:w="15" w:type="dxa"/>
+        </w:trPr>
+        <w:tc>
+          <w:tcPr>
+            <w:tcW w:w="0" w:type="auto"/>
+            <w:tcBorders>
+              <w:bottom w:val="single" w:sz="4" w:space="0" w:color="363840"/>
+            </w:tcBorders>
+            <w:vAlign w:val="center"/>
+            <w:hideMark/>
+          </w:tcPr>
+          <w:p>
+            <w:pPr>
+              <w:pStyle w:val="ListParagraph"/>
+            </w:pPr>
+            <w:r>
+              <w:rPr>
+                <w:b/>
+                <w:bCs/>
+              </w:rPr>
+              <w:t>Singular (Neuter)</w:t>
+            </w:r>
+          </w:p>
+        </w:tc>
+        <w:tc>
+          <w:tcPr>
+            <w:tcW w:w="0" w:type="auto"/>
+            <w:tcBorders>
+              <w:bottom w:val="single" w:sz="4" w:space="0" w:color="363840"/>
+            </w:tcBorders>
+            <w:vAlign w:val="center"/>
+            <w:hideMark/>
+          </w:tcPr>
+          <w:p>
+            <w:pPr>
+              <w:pStyle w:val="ListParagraph"/>
+            </w:pPr>
+            <w:r>
+              <w:t xml:space="preserve">es </w:t>
+            </w:r>
+            <w:r>
+              <w:rPr>
+                <w:i/>
+                <w:iCs/>
+              </w:rPr>
+              <w:t>(it)</w:t>
+            </w:r>
+          </w:p>
+        </w:tc>
+        <w:tc>
+          <w:tcPr>
+            <w:tcW w:w="0" w:type="auto"/>
+            <w:tcBorders>
+              <w:bottom w:val="single" w:sz="4" w:space="0" w:color="363840"/>
+            </w:tcBorders>
+            <w:vAlign w:val="center"/>
+            <w:hideMark/>
+          </w:tcPr>
+          <w:p>
+            <w:pPr>
+              <w:pStyle w:val="ListParagraph"/>
+            </w:pPr>
+            <w:r>
+              <w:t>es</w:t>
+            </w:r>
+          </w:p>
+        </w:tc>
+        <w:tc>
+          <w:tcPr>
+            <w:tcW w:w="0" w:type="auto"/>
+            <w:tcBorders>
+              <w:bottom w:val="single" w:sz="4" w:space="0" w:color="363840"/>
+            </w:tcBorders>
+            <w:vAlign w:val="center"/>
+            <w:hideMark/>
+          </w:tcPr>
+          <w:p>
+            <w:pPr>
+              <w:pStyle w:val="ListParagraph"/>
+            </w:pPr>
+            <w:r>
+              <w:t>ihm</w:t>
+            </w:r>
+          </w:p>
+        </w:tc>
+      </w:tr>
+      <w:tr>
+        <w:trPr>
+          <w:tblCellSpacing w:w="15" w:type="dxa"/>
+        </w:trPr>
+        <w:tc>
+          <w:tcPr>
+            <w:tcW w:w="0" w:type="auto"/>
+            <w:tcBorders>
+              <w:bottom w:val="single" w:sz="4" w:space="0" w:color="363840"/>
+            </w:tcBorders>
+            <w:vAlign w:val="center"/>
+            <w:hideMark/>
+          </w:tcPr>
+          <w:p>
+            <w:pPr>
+              <w:pStyle w:val="ListParagraph"/>
+            </w:pPr>
+            <w:r>
+              <w:rPr>
+                <w:b/>
+                <w:bCs/>
+              </w:rPr>
+              <w:t>Plural</w:t>
+            </w:r>
+          </w:p>
+        </w:tc>
+        <w:tc>
+          <w:tcPr>
+            <w:tcW w:w="0" w:type="auto"/>
+            <w:tcBorders>
+              <w:bottom w:val="single" w:sz="4" w:space="0" w:color="363840"/>
+            </w:tcBorders>
+            <w:vAlign w:val="center"/>
+            <w:hideMark/>
+          </w:tcPr>
+          <w:p>
+            <w:pPr>
+              <w:pStyle w:val="ListParagraph"/>
+            </w:pPr>
+            <w:r>
+              <w:t xml:space="preserve">wir </w:t>
+            </w:r>
+            <w:r>
+              <w:rPr>
+                <w:i/>
+                <w:iCs/>
+              </w:rPr>
+              <w:t>(we)</w:t>
+            </w:r>
+          </w:p>
+        </w:tc>
+        <w:tc>
+          <w:tcPr>
+            <w:tcW w:w="0" w:type="auto"/>
+            <w:tcBorders>
+              <w:bottom w:val="single" w:sz="4" w:space="0" w:color="363840"/>
+            </w:tcBorders>
+            <w:vAlign w:val="center"/>
+            <w:hideMark/>
+          </w:tcPr>
+          <w:p>
+            <w:pPr>
+              <w:pStyle w:val="ListParagraph"/>
+            </w:pPr>
+            <w:r>
+              <w:t>uns</w:t>
+            </w:r>
+          </w:p>
+        </w:tc>
+        <w:tc>
+          <w:tcPr>
+            <w:tcW w:w="0" w:type="auto"/>
+            <w:tcBorders>
+              <w:bottom w:val="single" w:sz="4" w:space="0" w:color="363840"/>
+            </w:tcBorders>
+            <w:vAlign w:val="center"/>
+            <w:hideMark/>
+          </w:tcPr>
+          <w:p>
+            <w:pPr>
+              <w:pStyle w:val="ListParagraph"/>
+            </w:pPr>
+            <w:r>
+              <w:t>uns</w:t>
+            </w:r>
+          </w:p>
+        </w:tc>
+      </w:tr>
+      <w:tr>
+        <w:trPr>
+          <w:tblCellSpacing w:w="15" w:type="dxa"/>
+        </w:trPr>
+        <w:tc>
+          <w:tcPr>
+            <w:tcW w:w="0" w:type="auto"/>
+            <w:tcBorders>
+              <w:bottom w:val="single" w:sz="4" w:space="0" w:color="363840"/>
+            </w:tcBorders>
+            <w:vAlign w:val="center"/>
+            <w:hideMark/>
+          </w:tcPr>
+          <w:p>
+            <w:pPr>
+              <w:pStyle w:val="ListParagraph"/>
+            </w:pPr>
+            <w:r>
+              <w:rPr>
+                <w:b/>
+                <w:bCs/>
+              </w:rPr>
+              <w:t>Plural</w:t>
+            </w:r>
+          </w:p>
+        </w:tc>
+        <w:tc>
+          <w:tcPr>
+            <w:tcW w:w="0" w:type="auto"/>
+            <w:tcBorders>
+              <w:bottom w:val="single" w:sz="4" w:space="0" w:color="363840"/>
+            </w:tcBorders>
+            <w:vAlign w:val="center"/>
+            <w:hideMark/>
+          </w:tcPr>
+          <w:p>
+            <w:pPr>
+              <w:pStyle w:val="ListParagraph"/>
+            </w:pPr>
+            <w:r>
+              <w:t xml:space="preserve">ihr </w:t>
+            </w:r>
+            <w:r>
+              <w:rPr>
+                <w:i/>
+                <w:iCs/>
+              </w:rPr>
+              <w:t>(you all, informal)</w:t>
+            </w:r>
+          </w:p>
+        </w:tc>
+        <w:tc>
+          <w:tcPr>
+            <w:tcW w:w="0" w:type="auto"/>
+            <w:tcBorders>
+              <w:bottom w:val="single" w:sz="4" w:space="0" w:color="363840"/>
+            </w:tcBorders>
+            <w:vAlign w:val="center"/>
+            <w:hideMark/>
+          </w:tcPr>
+          <w:p>
+            <w:pPr>
+              <w:pStyle w:val="ListParagraph"/>
+            </w:pPr>
+            <w:r>
+              <w:t>euch</w:t>
+            </w:r>
+          </w:p>
+        </w:tc>
+        <w:tc>
+          <w:tcPr>
+            <w:tcW w:w="0" w:type="auto"/>
+            <w:tcBorders>
+              <w:bottom w:val="single" w:sz="4" w:space="0" w:color="363840"/>
+            </w:tcBorders>
+            <w:vAlign w:val="center"/>
+            <w:hideMark/>
+          </w:tcPr>
+          <w:p>
+            <w:pPr>
+              <w:pStyle w:val="ListParagraph"/>
+            </w:pPr>
+            <w:r>
+              <w:t>euch</w:t>
+            </w:r>
+          </w:p>
+        </w:tc>
+      </w:tr>
+      <w:tr>
+        <w:trPr>
+          <w:tblCellSpacing w:w="15" w:type="dxa"/>
+        </w:trPr>
+        <w:tc>
+          <w:tcPr>
+            <w:tcW w:w="0" w:type="auto"/>
+            <w:tcBorders>
+              <w:bottom w:val="single" w:sz="4" w:space="0" w:color="363840"/>
+            </w:tcBorders>
+            <w:vAlign w:val="center"/>
+            <w:hideMark/>
+          </w:tcPr>
+          <w:p>
+            <w:pPr>
+              <w:pStyle w:val="ListParagraph"/>
+            </w:pPr>
+            <w:r>
+              <w:rPr>
+                <w:b/>
+                <w:bCs/>
+              </w:rPr>
+              <w:t>Plural</w:t>
+            </w:r>
+          </w:p>
+        </w:tc>
+        <w:tc>
+          <w:tcPr>
+            <w:tcW w:w="0" w:type="auto"/>
+            <w:tcBorders>
+              <w:bottom w:val="single" w:sz="4" w:space="0" w:color="363840"/>
+            </w:tcBorders>
+            <w:vAlign w:val="center"/>
+            <w:hideMark/>
+          </w:tcPr>
+          <w:p>
+            <w:pPr>
+              <w:pStyle w:val="ListParagraph"/>
+            </w:pPr>
+            <w:r>
+              <w:t xml:space="preserve">sie </w:t>
+            </w:r>
+            <w:r>
+              <w:rPr>
+                <w:i/>
+                <w:iCs/>
+              </w:rPr>
+              <w:t>(they)</w:t>
+            </w:r>
+          </w:p>
+        </w:tc>
+        <w:tc>
+          <w:tcPr>
+            <w:tcW w:w="0" w:type="auto"/>
+            <w:tcBorders>
+              <w:bottom w:val="single" w:sz="4" w:space="0" w:color="363840"/>
+            </w:tcBorders>
+            <w:vAlign w:val="center"/>
+            <w:hideMark/>
+          </w:tcPr>
+          <w:p>
+            <w:pPr>
+              <w:pStyle w:val="ListParagraph"/>
+            </w:pPr>
+            <w:r>
+              <w:t>sie</w:t>
+            </w:r>
+          </w:p>
+        </w:tc>
+        <w:tc>
+          <w:tcPr>
+            <w:tcW w:w="0" w:type="auto"/>
+            <w:tcBorders>
+              <w:bottom w:val="single" w:sz="4" w:space="0" w:color="363840"/>
+            </w:tcBorders>
+            <w:vAlign w:val="center"/>
+            <w:hideMark/>
+          </w:tcPr>
+          <w:p>
+            <w:pPr>
+              <w:pStyle w:val="ListParagraph"/>
+            </w:pPr>
+            <w:r>
+              <w:t>ihnen</w:t>
+            </w:r>
+          </w:p>
+        </w:tc>
+      </w:tr>
+      <w:tr>
+        <w:trPr>
+          <w:tblCellSpacing w:w="15" w:type="dxa"/>
+        </w:trPr>
+        <w:tc>
+          <w:tcPr>
+            <w:tcW w:w="0" w:type="auto"/>
+            <w:tcBorders>
+              <w:bottom w:val="single" w:sz="4" w:space="0" w:color="363840"/>
+            </w:tcBorders>
+            <w:vAlign w:val="center"/>
+            <w:hideMark/>
+          </w:tcPr>
+          <w:p>
+            <w:pPr>
+              <w:pStyle w:val="ListParagraph"/>
+            </w:pPr>
+            <w:r>
+              <w:rPr>
+                <w:b/>
+                <w:bCs/>
+              </w:rPr>
+              <w:t>Formell (Singular &amp; Plural)</w:t>
+            </w:r>
+          </w:p>
+        </w:tc>
+        <w:tc>
+          <w:tcPr>
+            <w:tcW w:w="0" w:type="auto"/>
+            <w:tcBorders>
+              <w:bottom w:val="single" w:sz="4" w:space="0" w:color="363840"/>
+            </w:tcBorders>
+            <w:vAlign w:val="center"/>
+            <w:hideMark/>
+          </w:tcPr>
+          <w:p>
+            <w:pPr>
+              <w:pStyle w:val="ListParagraph"/>
+            </w:pPr>
+            <w:r>
+              <w:t xml:space="preserve">Sie </w:t>
+            </w:r>
+            <w:r>
+              <w:rPr>
+                <w:i/>
+                <w:iCs/>
+              </w:rPr>
+              <w:t>(You, formal)</w:t>
+            </w:r>
+          </w:p>
+        </w:tc>
+        <w:tc>
+          <w:tcPr>
+            <w:tcW w:w="0" w:type="auto"/>
+            <w:tcBorders>
+              <w:bottom w:val="single" w:sz="4" w:space="0" w:color="363840"/>
+            </w:tcBorders>
+            <w:vAlign w:val="center"/>
+            <w:hideMark/>
+          </w:tcPr>
+          <w:p>
+            <w:pPr>
+              <w:pStyle w:val="ListParagraph"/>
+            </w:pPr>
+            <w:r>
+              <w:t>Sie</w:t>
+            </w:r>
+          </w:p>
+        </w:tc>
+        <w:tc>
+          <w:tcPr>
+            <w:tcW w:w="0" w:type="auto"/>
+            <w:tcBorders>
+              <w:bottom w:val="single" w:sz="4" w:space="0" w:color="363840"/>
+            </w:tcBorders>
+            <w:vAlign w:val="center"/>
+            <w:hideMark/>
+          </w:tcPr>
+          <w:p>
+            <w:pPr>
+              <w:pStyle w:val="ListParagraph"/>
+            </w:pPr>
+            <w:r>
+              <w:t>Ihnen</w:t>
+            </w:r>
+          </w:p>
+        </w:tc>
+      </w:tr>
+      <w:tr>
+        <w:trPr>
+          <w:tblCellSpacing w:w="15" w:type="dxa"/>
+        </w:trPr>
+        <w:tc>
+          <w:tcPr>
+            <w:tcW w:w="0" w:type="auto"/>
+            <w:tcBorders>
+              <w:bottom w:val="single" w:sz="4" w:space="0" w:color="363840"/>
+            </w:tcBorders>
+            <w:vAlign w:val="center"/>
+            <w:hideMark/>
+          </w:tcPr>
+          <w:p>
+            <w:pPr>
+              <w:pStyle w:val="ListParagraph"/>
+            </w:pPr>
+            <w:r>
+              <w:rPr>
+                <w:b/>
+                <w:bCs/>
+              </w:rPr>
+              <w:t>Verb Example (Dativ)</w:t>
+            </w:r>
+          </w:p>
+        </w:tc>
+        <w:tc>
+          <w:tcPr>
+            <w:tcW w:w="0" w:type="auto"/>
+            <w:tcBorders>
+              <w:bottom w:val="single" w:sz="4" w:space="0" w:color="363840"/>
+            </w:tcBorders>
+            <w:vAlign w:val="center"/>
+            <w:hideMark/>
+          </w:tcPr>
+          <w:p>
+            <w:pPr>
+              <w:pStyle w:val="ListParagraph"/>
+            </w:pPr>
+            <w:r>
+              <w:rPr>
+                <w:i/>
+                <w:iCs/>
+              </w:rPr>
+              <w:t>helfen / helfe</w:t>
+            </w:r>
+          </w:p>
+        </w:tc>
+        <w:tc>
+          <w:tcPr>
+            <w:tcW w:w="0" w:type="auto"/>
+            <w:tcBorders>
+              <w:bottom w:val="single" w:sz="4" w:space="0" w:color="363840"/>
+            </w:tcBorders>
+            <w:vAlign w:val="center"/>
+            <w:hideMark/>
+          </w:tcPr>
+          <w:p>
+            <w:pPr>
+              <w:pStyle w:val="ListParagraph"/>
+            </w:pPr>
+            <w:r>
+              <w:t>—</w:t>
+            </w:r>
+          </w:p>
+        </w:tc>
+        <w:tc>
+          <w:tcPr>
+            <w:tcW w:w="0" w:type="auto"/>
+            <w:tcBorders>
+              <w:bottom w:val="single" w:sz="4" w:space="0" w:color="363840"/>
+            </w:tcBorders>
+            <w:vAlign w:val="center"/>
+            <w:hideMark/>
+          </w:tcPr>
+          <w:p>
+            <w:pPr>
+              <w:pStyle w:val="ListParagraph"/>
+            </w:pPr>
+            <w:r>
+              <w:rPr>
+                <w:i/>
+                <w:iCs/>
+              </w:rPr>
+              <w:t>tut... mir/dir</w:t>
+            </w:r>
+          </w:p>
+        </w:tc>
+      </w:tr>
+      <w:tr>
+        <w:trPr>
+          <w:tblCellSpacing w:w="15" w:type="dxa"/>
+        </w:trPr>
+        <w:tc>
+          <w:tcPr>
+            <w:tcW w:w="0" w:type="auto"/>
+            <w:tcBorders>
+              <w:bottom w:val="nil"/>
+            </w:tcBorders>
+            <w:vAlign w:val="center"/>
+            <w:hideMark/>
+          </w:tcPr>
+          <w:p>
+            <w:pPr>
+              <w:pStyle w:val="ListParagraph"/>
+            </w:pPr>
+            <w:r>
+              <w:rPr>
+                <w:b/>
+                <w:bCs/>
+              </w:rPr>
+              <w:t>Grammar Note</w:t>
+            </w:r>
+          </w:p>
+        </w:tc>
+        <w:tc>
+          <w:tcPr>
+            <w:tcW w:w="0" w:type="auto"/>
+            <w:tcBorders>
+              <w:bottom w:val="nil"/>
+            </w:tcBorders>
+            <w:vAlign w:val="center"/>
+            <w:hideMark/>
+          </w:tcPr>
+          <w:p>
+            <w:pPr>
+              <w:pStyle w:val="ListParagraph"/>
+            </w:pPr>
+            <w:r>
+              <w:t>—</w:t>
+            </w:r>
+          </w:p>
+        </w:tc>
+        <w:tc>
+          <w:tcPr>
+            <w:tcW w:w="0" w:type="auto"/>
+            <w:tcBorders>
+              <w:bottom w:val="nil"/>
+            </w:tcBorders>
+            <w:vAlign w:val="center"/>
+            <w:hideMark/>
+          </w:tcPr>
+          <w:p>
+            <w:pPr>
+              <w:pStyle w:val="ListParagraph"/>
+            </w:pPr>
+            <w:r>
+              <w:rPr>
+                <w:b/>
+                <w:bCs/>
+              </w:rPr>
+              <w:t>Ergänzung im Akkusativ</w:t>
+            </w:r>
+          </w:p>
+        </w:tc>
+        <w:tc>
+          <w:tcPr>
+            <w:tcW w:w="0" w:type="auto"/>
+            <w:tcBorders>
+              <w:bottom w:val="nil"/>
+            </w:tcBorders>
+            <w:vAlign w:val="center"/>
+            <w:hideMark/>
+          </w:tcPr>
+          <w:p>
+            <w:pPr>
+              <w:pStyle w:val="ListParagraph"/>
+            </w:pPr>
+            <w:r>
+              <w:rPr>
+                <w:b/>
+                <w:bCs/>
+              </w:rPr>
+              <w:t>Ergänzung im Dativ</w:t>
+            </w:r>
+          </w:p>
+        </w:tc>
+      </w:tr>
+    </w:tbl>
+    <w:p>
+      <w:pPr>
+        <w:pStyle w:val="ListParagraph"/>
+      </w:pPr>
     </w:p>
     <w:sectPr>
       <w:pgSz w:w="11906" w:h="16838"/>
@@ -835,7 +1967,6 @@
   <w:style w:type="character" w:default="1" w:styleId="DefaultParagraphFont">
     <w:name w:val="Default Paragraph Font"/>
     <w:uiPriority w:val="1"/>
-    <w:semiHidden/>
     <w:unhideWhenUsed/>
   </w:style>
   <w:style w:type="table" w:default="1" w:styleId="TableNormal">

</xml_diff>

<commit_message>
add notes day 3
</commit_message>
<xml_diff>
--- a/Grammar Rules.docx
+++ b/Grammar Rules.docx
@@ -10,6 +10,7 @@
           <w:numId w:val="1"/>
         </w:numPr>
       </w:pPr>
+      <w:proofErr w:type="spellStart"/>
       <w:r>
         <w:rPr>
           <w:b/>
@@ -17,6 +18,7 @@
         </w:rPr>
         <w:t>außerdem</w:t>
       </w:r>
+      <w:proofErr w:type="spellEnd"/>
       <w:r>
         <w:t xml:space="preserve"> </w:t>
       </w:r>
@@ -33,7 +35,39 @@
         </w:numPr>
       </w:pPr>
       <w:r>
-        <w:t xml:space="preserve">irregular verbs for the past get ge+en and the regular ones get ge+t. example Fahren gefahren, fruehstuecken </w:t>
+        <w:t xml:space="preserve">irregular verbs for the past get </w:t>
+      </w:r>
+      <w:proofErr w:type="spellStart"/>
+      <w:r>
+        <w:t>ge+en</w:t>
+      </w:r>
+      <w:proofErr w:type="spellEnd"/>
+      <w:r>
+        <w:t xml:space="preserve"> and the regular ones get </w:t>
+      </w:r>
+      <w:proofErr w:type="spellStart"/>
+      <w:r>
+        <w:t>ge+t</w:t>
+      </w:r>
+      <w:proofErr w:type="spellEnd"/>
+      <w:r>
+        <w:t xml:space="preserve">. example Fahren </w:t>
+      </w:r>
+      <w:proofErr w:type="spellStart"/>
+      <w:r>
+        <w:t>gefahren</w:t>
+      </w:r>
+      <w:proofErr w:type="spellEnd"/>
+      <w:r>
+        <w:t xml:space="preserve">, </w:t>
+      </w:r>
+      <w:proofErr w:type="spellStart"/>
+      <w:r>
+        <w:t>fruehstuecken</w:t>
+      </w:r>
+      <w:proofErr w:type="spellEnd"/>
+      <w:r>
+        <w:t xml:space="preserve"> </w:t>
       </w:r>
       <w:r>
         <w:sym w:font="Wingdings" w:char="F0E0"/>
@@ -41,9 +75,11 @@
       <w:r>
         <w:t xml:space="preserve"> </w:t>
       </w:r>
+      <w:proofErr w:type="spellStart"/>
       <w:r>
         <w:t>gefrühstück</w:t>
       </w:r>
+      <w:proofErr w:type="spellEnd"/>
     </w:p>
     <w:p>
       <w:pPr>
@@ -54,7 +90,41 @@
         </w:numPr>
       </w:pPr>
       <w:r>
-        <w:t>for the past we use the haben and the sein verb in pratratim fuck I cant write it. But it will be hatte and war for example</w:t>
+        <w:t xml:space="preserve">for the past we use the </w:t>
+      </w:r>
+      <w:proofErr w:type="spellStart"/>
+      <w:r>
+        <w:t>haben</w:t>
+      </w:r>
+      <w:proofErr w:type="spellEnd"/>
+      <w:r>
+        <w:t xml:space="preserve"> and the sein verb in </w:t>
+      </w:r>
+      <w:proofErr w:type="spellStart"/>
+      <w:r>
+        <w:t>pratratim</w:t>
+      </w:r>
+      <w:proofErr w:type="spellEnd"/>
+      <w:r>
+        <w:t xml:space="preserve"> fuck I </w:t>
+      </w:r>
+      <w:proofErr w:type="spellStart"/>
+      <w:proofErr w:type="gramStart"/>
+      <w:r>
+        <w:t>cant</w:t>
+      </w:r>
+      <w:proofErr w:type="spellEnd"/>
+      <w:proofErr w:type="gramEnd"/>
+      <w:r>
+        <w:t xml:space="preserve"> write it. But it will be </w:t>
+      </w:r>
+      <w:proofErr w:type="spellStart"/>
+      <w:r>
+        <w:t>hatte</w:t>
+      </w:r>
+      <w:proofErr w:type="spellEnd"/>
+      <w:r>
+        <w:t xml:space="preserve"> and war for example</w:t>
       </w:r>
     </w:p>
     <w:p>
@@ -66,11 +136,40 @@
         </w:numPr>
       </w:pPr>
       <w:r>
-        <w:t>sein aufstehen when we are talk</w:t>
-      </w:r>
-      <w:r>
-        <w:t>ing about the past so ist aufgestanden not hat aufgestanden</w:t>
-      </w:r>
+        <w:t xml:space="preserve">sein </w:t>
+      </w:r>
+      <w:proofErr w:type="spellStart"/>
+      <w:r>
+        <w:t>aufstehen</w:t>
+      </w:r>
+      <w:proofErr w:type="spellEnd"/>
+      <w:r>
+        <w:t xml:space="preserve"> when we are talk</w:t>
+      </w:r>
+      <w:r>
+        <w:t xml:space="preserve">ing about the past so </w:t>
+      </w:r>
+      <w:proofErr w:type="spellStart"/>
+      <w:r>
+        <w:t>ist</w:t>
+      </w:r>
+      <w:proofErr w:type="spellEnd"/>
+      <w:r>
+        <w:t xml:space="preserve"> </w:t>
+      </w:r>
+      <w:proofErr w:type="spellStart"/>
+      <w:r>
+        <w:t>aufgestanden</w:t>
+      </w:r>
+      <w:proofErr w:type="spellEnd"/>
+      <w:r>
+        <w:t xml:space="preserve"> not hat </w:t>
+      </w:r>
+      <w:proofErr w:type="spellStart"/>
+      <w:r>
+        <w:t>aufgestanden</w:t>
+      </w:r>
+      <w:proofErr w:type="spellEnd"/>
     </w:p>
     <w:p>
       <w:pPr>
@@ -80,15 +179,25 @@
           <w:numId w:val="1"/>
         </w:numPr>
       </w:pPr>
-      <w:r>
-        <w:t xml:space="preserve">denn + ich </w:t>
+      <w:proofErr w:type="spellStart"/>
+      <w:r>
+        <w:t>denn</w:t>
+      </w:r>
+      <w:proofErr w:type="spellEnd"/>
+      <w:r>
+        <w:t xml:space="preserve"> + ich </w:t>
       </w:r>
       <w:r>
         <w:sym w:font="Wingdings" w:char="F0E8"/>
       </w:r>
       <w:r>
-        <w:t xml:space="preserve"> because i</w:t>
-      </w:r>
+        <w:t xml:space="preserve"> because </w:t>
+      </w:r>
+      <w:proofErr w:type="spellStart"/>
+      <w:r>
+        <w:t>i</w:t>
+      </w:r>
+      <w:proofErr w:type="spellEnd"/>
     </w:p>
     <w:p>
       <w:pPr>
@@ -98,9 +207,19 @@
           <w:numId w:val="1"/>
         </w:numPr>
       </w:pPr>
-      <w:r>
-        <w:t>verspatung haben</w:t>
-      </w:r>
+      <w:proofErr w:type="spellStart"/>
+      <w:r>
+        <w:t>verspatung</w:t>
+      </w:r>
+      <w:proofErr w:type="spellEnd"/>
+      <w:r>
+        <w:t xml:space="preserve"> </w:t>
+      </w:r>
+      <w:proofErr w:type="spellStart"/>
+      <w:r>
+        <w:t>haben</w:t>
+      </w:r>
+      <w:proofErr w:type="spellEnd"/>
     </w:p>
     <w:p>
       <w:pPr>
@@ -110,8 +229,13 @@
           <w:numId w:val="1"/>
         </w:numPr>
       </w:pPr>
-      <w:r>
-        <w:t>aber + something + verb</w:t>
+      <w:proofErr w:type="spellStart"/>
+      <w:r>
+        <w:t>aber</w:t>
+      </w:r>
+      <w:proofErr w:type="spellEnd"/>
+      <w:r>
+        <w:t xml:space="preserve"> + something + verb</w:t>
       </w:r>
     </w:p>
     <w:p>
@@ -123,8 +247,79 @@
         </w:numPr>
       </w:pPr>
       <w:r>
-        <w:t>to answer for wohin we answer in the akkusativ so wohin gehst du? Ins fitness studio.But if we make the question wo bist du? Im fitnessstudio</w:t>
-      </w:r>
+        <w:t xml:space="preserve">to answer for </w:t>
+      </w:r>
+      <w:proofErr w:type="spellStart"/>
+      <w:r>
+        <w:t>wohin</w:t>
+      </w:r>
+      <w:proofErr w:type="spellEnd"/>
+      <w:r>
+        <w:t xml:space="preserve"> we answer in the </w:t>
+      </w:r>
+      <w:proofErr w:type="spellStart"/>
+      <w:r>
+        <w:t>akkusativ</w:t>
+      </w:r>
+      <w:proofErr w:type="spellEnd"/>
+      <w:r>
+        <w:t xml:space="preserve"> so </w:t>
+      </w:r>
+      <w:proofErr w:type="spellStart"/>
+      <w:r>
+        <w:t>wohin</w:t>
+      </w:r>
+      <w:proofErr w:type="spellEnd"/>
+      <w:r>
+        <w:t xml:space="preserve"> </w:t>
+      </w:r>
+      <w:proofErr w:type="spellStart"/>
+      <w:r>
+        <w:t>gehst</w:t>
+      </w:r>
+      <w:proofErr w:type="spellEnd"/>
+      <w:r>
+        <w:t xml:space="preserve"> du? Ins fitness </w:t>
+      </w:r>
+      <w:proofErr w:type="spellStart"/>
+      <w:proofErr w:type="gramStart"/>
+      <w:r>
+        <w:t>studio.But</w:t>
+      </w:r>
+      <w:proofErr w:type="spellEnd"/>
+      <w:proofErr w:type="gramEnd"/>
+      <w:r>
+        <w:t xml:space="preserve"> if we make the question wo </w:t>
+      </w:r>
+      <w:proofErr w:type="spellStart"/>
+      <w:r>
+        <w:t>bist</w:t>
+      </w:r>
+      <w:proofErr w:type="spellEnd"/>
+      <w:r>
+        <w:t xml:space="preserve"> </w:t>
+      </w:r>
+      <w:proofErr w:type="spellStart"/>
+      <w:r>
+        <w:t>du</w:t>
+      </w:r>
+      <w:proofErr w:type="spellEnd"/>
+      <w:r>
+        <w:t xml:space="preserve">? </w:t>
+      </w:r>
+      <w:proofErr w:type="spellStart"/>
+      <w:r>
+        <w:t>Im</w:t>
+      </w:r>
+      <w:proofErr w:type="spellEnd"/>
+      <w:r>
+        <w:t xml:space="preserve"> </w:t>
+      </w:r>
+      <w:proofErr w:type="spellStart"/>
+      <w:r>
+        <w:t>fitnessstudio</w:t>
+      </w:r>
+      <w:proofErr w:type="spellEnd"/>
     </w:p>
     <w:p>
       <w:pPr>
@@ -196,64 +391,91 @@
                 <w:bCs/>
               </w:rPr>
             </w:pPr>
-            <w:r>
-              <w:rPr>
-                <w:b/>
-                <w:bCs/>
-              </w:rPr>
-              <w:t>Nominativ (Subject)</w:t>
-            </w:r>
-          </w:p>
-        </w:tc>
-        <w:tc>
-          <w:tcPr>
-            <w:tcW w:w="0" w:type="auto"/>
-            <w:tcBorders>
-              <w:bottom w:val="single" w:sz="4" w:space="0" w:color="363840"/>
-            </w:tcBorders>
-            <w:vAlign w:val="center"/>
-            <w:hideMark/>
-          </w:tcPr>
-          <w:p>
-            <w:pPr>
-              <w:pStyle w:val="ListParagraph"/>
-              <w:rPr>
-                <w:b/>
-                <w:bCs/>
-              </w:rPr>
-            </w:pPr>
-            <w:r>
-              <w:rPr>
-                <w:b/>
-                <w:bCs/>
-              </w:rPr>
-              <w:t>Akkusativ (Direct Object)</w:t>
-            </w:r>
-          </w:p>
-        </w:tc>
-        <w:tc>
-          <w:tcPr>
-            <w:tcW w:w="0" w:type="auto"/>
-            <w:tcBorders>
-              <w:bottom w:val="single" w:sz="4" w:space="0" w:color="363840"/>
-            </w:tcBorders>
-            <w:vAlign w:val="center"/>
-            <w:hideMark/>
-          </w:tcPr>
-          <w:p>
-            <w:pPr>
-              <w:pStyle w:val="ListParagraph"/>
-              <w:rPr>
-                <w:b/>
-                <w:bCs/>
-              </w:rPr>
-            </w:pPr>
-            <w:r>
-              <w:rPr>
-                <w:b/>
-                <w:bCs/>
-              </w:rPr>
-              <w:t>Dativ (Indirect Object)</w:t>
+            <w:proofErr w:type="spellStart"/>
+            <w:r>
+              <w:rPr>
+                <w:b/>
+                <w:bCs/>
+              </w:rPr>
+              <w:t>Nominativ</w:t>
+            </w:r>
+            <w:proofErr w:type="spellEnd"/>
+            <w:r>
+              <w:rPr>
+                <w:b/>
+                <w:bCs/>
+              </w:rPr>
+              <w:t xml:space="preserve"> (Subject)</w:t>
+            </w:r>
+          </w:p>
+        </w:tc>
+        <w:tc>
+          <w:tcPr>
+            <w:tcW w:w="0" w:type="auto"/>
+            <w:tcBorders>
+              <w:bottom w:val="single" w:sz="4" w:space="0" w:color="363840"/>
+            </w:tcBorders>
+            <w:vAlign w:val="center"/>
+            <w:hideMark/>
+          </w:tcPr>
+          <w:p>
+            <w:pPr>
+              <w:pStyle w:val="ListParagraph"/>
+              <w:rPr>
+                <w:b/>
+                <w:bCs/>
+              </w:rPr>
+            </w:pPr>
+            <w:proofErr w:type="spellStart"/>
+            <w:r>
+              <w:rPr>
+                <w:b/>
+                <w:bCs/>
+              </w:rPr>
+              <w:t>Akkusativ</w:t>
+            </w:r>
+            <w:proofErr w:type="spellEnd"/>
+            <w:r>
+              <w:rPr>
+                <w:b/>
+                <w:bCs/>
+              </w:rPr>
+              <w:t xml:space="preserve"> (Direct Object)</w:t>
+            </w:r>
+          </w:p>
+        </w:tc>
+        <w:tc>
+          <w:tcPr>
+            <w:tcW w:w="0" w:type="auto"/>
+            <w:tcBorders>
+              <w:bottom w:val="single" w:sz="4" w:space="0" w:color="363840"/>
+            </w:tcBorders>
+            <w:vAlign w:val="center"/>
+            <w:hideMark/>
+          </w:tcPr>
+          <w:p>
+            <w:pPr>
+              <w:pStyle w:val="ListParagraph"/>
+              <w:rPr>
+                <w:b/>
+                <w:bCs/>
+              </w:rPr>
+            </w:pPr>
+            <w:proofErr w:type="spellStart"/>
+            <w:r>
+              <w:rPr>
+                <w:b/>
+                <w:bCs/>
+              </w:rPr>
+              <w:t>Dativ</w:t>
+            </w:r>
+            <w:proofErr w:type="spellEnd"/>
+            <w:r>
+              <w:rPr>
+                <w:b/>
+                <w:bCs/>
+              </w:rPr>
+              <w:t xml:space="preserve"> (Indirect Object)</w:t>
             </w:r>
           </w:p>
         </w:tc>
@@ -322,9 +544,11 @@
             <w:pPr>
               <w:pStyle w:val="ListParagraph"/>
             </w:pPr>
+            <w:proofErr w:type="spellStart"/>
             <w:r>
               <w:t>mich</w:t>
             </w:r>
+            <w:proofErr w:type="spellEnd"/>
           </w:p>
         </w:tc>
         <w:tc>
@@ -428,9 +652,11 @@
             <w:pPr>
               <w:pStyle w:val="ListParagraph"/>
             </w:pPr>
+            <w:proofErr w:type="spellStart"/>
             <w:r>
               <w:t>dir</w:t>
             </w:r>
+            <w:proofErr w:type="spellEnd"/>
           </w:p>
         </w:tc>
       </w:tr>
@@ -498,27 +724,31 @@
             <w:pPr>
               <w:pStyle w:val="ListParagraph"/>
             </w:pPr>
+            <w:proofErr w:type="spellStart"/>
             <w:r>
               <w:t>ihn</w:t>
             </w:r>
-          </w:p>
-        </w:tc>
-        <w:tc>
-          <w:tcPr>
-            <w:tcW w:w="0" w:type="auto"/>
-            <w:tcBorders>
-              <w:bottom w:val="single" w:sz="4" w:space="0" w:color="363840"/>
-            </w:tcBorders>
-            <w:vAlign w:val="center"/>
-            <w:hideMark/>
-          </w:tcPr>
-          <w:p>
-            <w:pPr>
-              <w:pStyle w:val="ListParagraph"/>
-            </w:pPr>
+            <w:proofErr w:type="spellEnd"/>
+          </w:p>
+        </w:tc>
+        <w:tc>
+          <w:tcPr>
+            <w:tcW w:w="0" w:type="auto"/>
+            <w:tcBorders>
+              <w:bottom w:val="single" w:sz="4" w:space="0" w:color="363840"/>
+            </w:tcBorders>
+            <w:vAlign w:val="center"/>
+            <w:hideMark/>
+          </w:tcPr>
+          <w:p>
+            <w:pPr>
+              <w:pStyle w:val="ListParagraph"/>
+            </w:pPr>
+            <w:proofErr w:type="spellStart"/>
             <w:r>
               <w:t>ihm</w:t>
             </w:r>
+            <w:proofErr w:type="spellEnd"/>
           </w:p>
         </w:tc>
       </w:tr>
@@ -561,8 +791,13 @@
             <w:pPr>
               <w:pStyle w:val="ListParagraph"/>
             </w:pPr>
-            <w:r>
-              <w:t xml:space="preserve">sie </w:t>
+            <w:proofErr w:type="spellStart"/>
+            <w:r>
+              <w:t>sie</w:t>
+            </w:r>
+            <w:proofErr w:type="spellEnd"/>
+            <w:r>
+              <w:t xml:space="preserve"> </w:t>
             </w:r>
             <w:r>
               <w:rPr>
@@ -586,27 +821,31 @@
             <w:pPr>
               <w:pStyle w:val="ListParagraph"/>
             </w:pPr>
+            <w:proofErr w:type="spellStart"/>
             <w:r>
               <w:t>sie</w:t>
             </w:r>
-          </w:p>
-        </w:tc>
-        <w:tc>
-          <w:tcPr>
-            <w:tcW w:w="0" w:type="auto"/>
-            <w:tcBorders>
-              <w:bottom w:val="single" w:sz="4" w:space="0" w:color="363840"/>
-            </w:tcBorders>
-            <w:vAlign w:val="center"/>
-            <w:hideMark/>
-          </w:tcPr>
-          <w:p>
-            <w:pPr>
-              <w:pStyle w:val="ListParagraph"/>
-            </w:pPr>
+            <w:proofErr w:type="spellEnd"/>
+          </w:p>
+        </w:tc>
+        <w:tc>
+          <w:tcPr>
+            <w:tcW w:w="0" w:type="auto"/>
+            <w:tcBorders>
+              <w:bottom w:val="single" w:sz="4" w:space="0" w:color="363840"/>
+            </w:tcBorders>
+            <w:vAlign w:val="center"/>
+            <w:hideMark/>
+          </w:tcPr>
+          <w:p>
+            <w:pPr>
+              <w:pStyle w:val="ListParagraph"/>
+            </w:pPr>
+            <w:proofErr w:type="spellStart"/>
             <w:r>
               <w:t>ihr</w:t>
             </w:r>
+            <w:proofErr w:type="spellEnd"/>
           </w:p>
         </w:tc>
       </w:tr>
@@ -692,9 +931,11 @@
             <w:pPr>
               <w:pStyle w:val="ListParagraph"/>
             </w:pPr>
+            <w:proofErr w:type="spellStart"/>
             <w:r>
               <w:t>ihm</w:t>
             </w:r>
+            <w:proofErr w:type="spellEnd"/>
           </w:p>
         </w:tc>
       </w:tr>
@@ -737,8 +978,13 @@
             <w:pPr>
               <w:pStyle w:val="ListParagraph"/>
             </w:pPr>
-            <w:r>
-              <w:t xml:space="preserve">wir </w:t>
+            <w:proofErr w:type="spellStart"/>
+            <w:r>
+              <w:t>wir</w:t>
+            </w:r>
+            <w:proofErr w:type="spellEnd"/>
+            <w:r>
+              <w:t xml:space="preserve"> </w:t>
             </w:r>
             <w:r>
               <w:rPr>
@@ -762,27 +1008,31 @@
             <w:pPr>
               <w:pStyle w:val="ListParagraph"/>
             </w:pPr>
+            <w:proofErr w:type="spellStart"/>
             <w:r>
               <w:t>uns</w:t>
             </w:r>
-          </w:p>
-        </w:tc>
-        <w:tc>
-          <w:tcPr>
-            <w:tcW w:w="0" w:type="auto"/>
-            <w:tcBorders>
-              <w:bottom w:val="single" w:sz="4" w:space="0" w:color="363840"/>
-            </w:tcBorders>
-            <w:vAlign w:val="center"/>
-            <w:hideMark/>
-          </w:tcPr>
-          <w:p>
-            <w:pPr>
-              <w:pStyle w:val="ListParagraph"/>
-            </w:pPr>
+            <w:proofErr w:type="spellEnd"/>
+          </w:p>
+        </w:tc>
+        <w:tc>
+          <w:tcPr>
+            <w:tcW w:w="0" w:type="auto"/>
+            <w:tcBorders>
+              <w:bottom w:val="single" w:sz="4" w:space="0" w:color="363840"/>
+            </w:tcBorders>
+            <w:vAlign w:val="center"/>
+            <w:hideMark/>
+          </w:tcPr>
+          <w:p>
+            <w:pPr>
+              <w:pStyle w:val="ListParagraph"/>
+            </w:pPr>
+            <w:proofErr w:type="spellStart"/>
             <w:r>
               <w:t>uns</w:t>
             </w:r>
+            <w:proofErr w:type="spellEnd"/>
           </w:p>
         </w:tc>
       </w:tr>
@@ -825,8 +1075,13 @@
             <w:pPr>
               <w:pStyle w:val="ListParagraph"/>
             </w:pPr>
-            <w:r>
-              <w:t xml:space="preserve">ihr </w:t>
+            <w:proofErr w:type="spellStart"/>
+            <w:r>
+              <w:t>ihr</w:t>
+            </w:r>
+            <w:proofErr w:type="spellEnd"/>
+            <w:r>
+              <w:t xml:space="preserve"> </w:t>
             </w:r>
             <w:r>
               <w:rPr>
@@ -850,27 +1105,31 @@
             <w:pPr>
               <w:pStyle w:val="ListParagraph"/>
             </w:pPr>
+            <w:proofErr w:type="spellStart"/>
             <w:r>
               <w:t>euch</w:t>
             </w:r>
-          </w:p>
-        </w:tc>
-        <w:tc>
-          <w:tcPr>
-            <w:tcW w:w="0" w:type="auto"/>
-            <w:tcBorders>
-              <w:bottom w:val="single" w:sz="4" w:space="0" w:color="363840"/>
-            </w:tcBorders>
-            <w:vAlign w:val="center"/>
-            <w:hideMark/>
-          </w:tcPr>
-          <w:p>
-            <w:pPr>
-              <w:pStyle w:val="ListParagraph"/>
-            </w:pPr>
+            <w:proofErr w:type="spellEnd"/>
+          </w:p>
+        </w:tc>
+        <w:tc>
+          <w:tcPr>
+            <w:tcW w:w="0" w:type="auto"/>
+            <w:tcBorders>
+              <w:bottom w:val="single" w:sz="4" w:space="0" w:color="363840"/>
+            </w:tcBorders>
+            <w:vAlign w:val="center"/>
+            <w:hideMark/>
+          </w:tcPr>
+          <w:p>
+            <w:pPr>
+              <w:pStyle w:val="ListParagraph"/>
+            </w:pPr>
+            <w:proofErr w:type="spellStart"/>
             <w:r>
               <w:t>euch</w:t>
             </w:r>
+            <w:proofErr w:type="spellEnd"/>
           </w:p>
         </w:tc>
       </w:tr>
@@ -913,8 +1172,13 @@
             <w:pPr>
               <w:pStyle w:val="ListParagraph"/>
             </w:pPr>
-            <w:r>
-              <w:t xml:space="preserve">sie </w:t>
+            <w:proofErr w:type="spellStart"/>
+            <w:r>
+              <w:t>sie</w:t>
+            </w:r>
+            <w:proofErr w:type="spellEnd"/>
+            <w:r>
+              <w:t xml:space="preserve"> </w:t>
             </w:r>
             <w:r>
               <w:rPr>
@@ -938,27 +1202,31 @@
             <w:pPr>
               <w:pStyle w:val="ListParagraph"/>
             </w:pPr>
+            <w:proofErr w:type="spellStart"/>
             <w:r>
               <w:t>sie</w:t>
             </w:r>
-          </w:p>
-        </w:tc>
-        <w:tc>
-          <w:tcPr>
-            <w:tcW w:w="0" w:type="auto"/>
-            <w:tcBorders>
-              <w:bottom w:val="single" w:sz="4" w:space="0" w:color="363840"/>
-            </w:tcBorders>
-            <w:vAlign w:val="center"/>
-            <w:hideMark/>
-          </w:tcPr>
-          <w:p>
-            <w:pPr>
-              <w:pStyle w:val="ListParagraph"/>
-            </w:pPr>
+            <w:proofErr w:type="spellEnd"/>
+          </w:p>
+        </w:tc>
+        <w:tc>
+          <w:tcPr>
+            <w:tcW w:w="0" w:type="auto"/>
+            <w:tcBorders>
+              <w:bottom w:val="single" w:sz="4" w:space="0" w:color="363840"/>
+            </w:tcBorders>
+            <w:vAlign w:val="center"/>
+            <w:hideMark/>
+          </w:tcPr>
+          <w:p>
+            <w:pPr>
+              <w:pStyle w:val="ListParagraph"/>
+            </w:pPr>
+            <w:proofErr w:type="spellStart"/>
             <w:r>
               <w:t>ihnen</w:t>
             </w:r>
+            <w:proofErr w:type="spellEnd"/>
           </w:p>
         </w:tc>
       </w:tr>
@@ -979,12 +1247,21 @@
             <w:pPr>
               <w:pStyle w:val="ListParagraph"/>
             </w:pPr>
-            <w:r>
-              <w:rPr>
-                <w:b/>
-                <w:bCs/>
-              </w:rPr>
-              <w:t>Formell (Singular &amp; Plural)</w:t>
+            <w:proofErr w:type="spellStart"/>
+            <w:r>
+              <w:rPr>
+                <w:b/>
+                <w:bCs/>
+              </w:rPr>
+              <w:t>Formell</w:t>
+            </w:r>
+            <w:proofErr w:type="spellEnd"/>
+            <w:r>
+              <w:rPr>
+                <w:b/>
+                <w:bCs/>
+              </w:rPr>
+              <w:t xml:space="preserve"> (Singular &amp; Plural)</w:t>
             </w:r>
           </w:p>
         </w:tc>
@@ -1072,70 +1349,113 @@
                 <w:b/>
                 <w:bCs/>
               </w:rPr>
-              <w:t>Verb Example (Dativ)</w:t>
-            </w:r>
-          </w:p>
-        </w:tc>
-        <w:tc>
-          <w:tcPr>
-            <w:tcW w:w="0" w:type="auto"/>
-            <w:tcBorders>
-              <w:bottom w:val="single" w:sz="4" w:space="0" w:color="363840"/>
-            </w:tcBorders>
-            <w:vAlign w:val="center"/>
-            <w:hideMark/>
-          </w:tcPr>
-          <w:p>
-            <w:pPr>
-              <w:pStyle w:val="ListParagraph"/>
-            </w:pPr>
+              <w:t>Verb Example (</w:t>
+            </w:r>
+            <w:proofErr w:type="spellStart"/>
+            <w:r>
+              <w:rPr>
+                <w:b/>
+                <w:bCs/>
+              </w:rPr>
+              <w:t>Dativ</w:t>
+            </w:r>
+            <w:proofErr w:type="spellEnd"/>
+            <w:r>
+              <w:rPr>
+                <w:b/>
+                <w:bCs/>
+              </w:rPr>
+              <w:t>)</w:t>
+            </w:r>
+          </w:p>
+        </w:tc>
+        <w:tc>
+          <w:tcPr>
+            <w:tcW w:w="0" w:type="auto"/>
+            <w:tcBorders>
+              <w:bottom w:val="single" w:sz="4" w:space="0" w:color="363840"/>
+            </w:tcBorders>
+            <w:vAlign w:val="center"/>
+            <w:hideMark/>
+          </w:tcPr>
+          <w:p>
+            <w:pPr>
+              <w:pStyle w:val="ListParagraph"/>
+            </w:pPr>
+            <w:proofErr w:type="spellStart"/>
             <w:r>
               <w:rPr>
                 <w:i/>
                 <w:iCs/>
               </w:rPr>
-              <w:t>helfen / helfe</w:t>
-            </w:r>
-          </w:p>
-        </w:tc>
-        <w:tc>
-          <w:tcPr>
-            <w:tcW w:w="0" w:type="auto"/>
-            <w:tcBorders>
-              <w:bottom w:val="single" w:sz="4" w:space="0" w:color="363840"/>
-            </w:tcBorders>
-            <w:vAlign w:val="center"/>
-            <w:hideMark/>
-          </w:tcPr>
-          <w:p>
-            <w:pPr>
-              <w:pStyle w:val="ListParagraph"/>
-            </w:pPr>
-            <w:r>
-              <w:t>—</w:t>
-            </w:r>
-          </w:p>
-        </w:tc>
-        <w:tc>
-          <w:tcPr>
-            <w:tcW w:w="0" w:type="auto"/>
-            <w:tcBorders>
-              <w:bottom w:val="single" w:sz="4" w:space="0" w:color="363840"/>
-            </w:tcBorders>
-            <w:vAlign w:val="center"/>
-            <w:hideMark/>
-          </w:tcPr>
-          <w:p>
-            <w:pPr>
-              <w:pStyle w:val="ListParagraph"/>
-            </w:pPr>
+              <w:t>helfen</w:t>
+            </w:r>
+            <w:proofErr w:type="spellEnd"/>
             <w:r>
               <w:rPr>
                 <w:i/>
                 <w:iCs/>
               </w:rPr>
-              <w:t>tut... mir/dir</w:t>
-            </w:r>
+              <w:t xml:space="preserve"> / </w:t>
+            </w:r>
+            <w:proofErr w:type="spellStart"/>
+            <w:r>
+              <w:rPr>
+                <w:i/>
+                <w:iCs/>
+              </w:rPr>
+              <w:t>helfe</w:t>
+            </w:r>
+            <w:proofErr w:type="spellEnd"/>
+          </w:p>
+        </w:tc>
+        <w:tc>
+          <w:tcPr>
+            <w:tcW w:w="0" w:type="auto"/>
+            <w:tcBorders>
+              <w:bottom w:val="single" w:sz="4" w:space="0" w:color="363840"/>
+            </w:tcBorders>
+            <w:vAlign w:val="center"/>
+            <w:hideMark/>
+          </w:tcPr>
+          <w:p>
+            <w:pPr>
+              <w:pStyle w:val="ListParagraph"/>
+            </w:pPr>
+            <w:r>
+              <w:t>—</w:t>
+            </w:r>
+          </w:p>
+        </w:tc>
+        <w:tc>
+          <w:tcPr>
+            <w:tcW w:w="0" w:type="auto"/>
+            <w:tcBorders>
+              <w:bottom w:val="single" w:sz="4" w:space="0" w:color="363840"/>
+            </w:tcBorders>
+            <w:vAlign w:val="center"/>
+            <w:hideMark/>
+          </w:tcPr>
+          <w:p>
+            <w:pPr>
+              <w:pStyle w:val="ListParagraph"/>
+            </w:pPr>
+            <w:r>
+              <w:rPr>
+                <w:i/>
+                <w:iCs/>
+              </w:rPr>
+              <w:t>tut... mir/</w:t>
+            </w:r>
+            <w:proofErr w:type="spellStart"/>
+            <w:r>
+              <w:rPr>
+                <w:i/>
+                <w:iCs/>
+              </w:rPr>
+              <w:t>dir</w:t>
+            </w:r>
+            <w:proofErr w:type="spellEnd"/>
           </w:p>
         </w:tc>
       </w:tr>
@@ -1196,13 +1516,47 @@
             <w:pPr>
               <w:pStyle w:val="ListParagraph"/>
             </w:pPr>
-            <w:r>
-              <w:rPr>
-                <w:b/>
-                <w:bCs/>
-              </w:rPr>
-              <w:t>Ergänzung im Akkusativ</w:t>
-            </w:r>
+            <w:proofErr w:type="spellStart"/>
+            <w:r>
+              <w:rPr>
+                <w:b/>
+                <w:bCs/>
+              </w:rPr>
+              <w:t>Ergänzung</w:t>
+            </w:r>
+            <w:proofErr w:type="spellEnd"/>
+            <w:r>
+              <w:rPr>
+                <w:b/>
+                <w:bCs/>
+              </w:rPr>
+              <w:t xml:space="preserve"> </w:t>
+            </w:r>
+            <w:proofErr w:type="spellStart"/>
+            <w:r>
+              <w:rPr>
+                <w:b/>
+                <w:bCs/>
+              </w:rPr>
+              <w:t>im</w:t>
+            </w:r>
+            <w:proofErr w:type="spellEnd"/>
+            <w:r>
+              <w:rPr>
+                <w:b/>
+                <w:bCs/>
+              </w:rPr>
+              <w:t xml:space="preserve"> </w:t>
+            </w:r>
+            <w:proofErr w:type="spellStart"/>
+            <w:r>
+              <w:rPr>
+                <w:b/>
+                <w:bCs/>
+              </w:rPr>
+              <w:t>Akkusativ</w:t>
+            </w:r>
+            <w:proofErr w:type="spellEnd"/>
           </w:p>
         </w:tc>
         <w:tc>
@@ -1218,13 +1572,47 @@
             <w:pPr>
               <w:pStyle w:val="ListParagraph"/>
             </w:pPr>
-            <w:r>
-              <w:rPr>
-                <w:b/>
-                <w:bCs/>
-              </w:rPr>
-              <w:t>Ergänzung im Dativ</w:t>
-            </w:r>
+            <w:proofErr w:type="spellStart"/>
+            <w:r>
+              <w:rPr>
+                <w:b/>
+                <w:bCs/>
+              </w:rPr>
+              <w:t>Ergänzung</w:t>
+            </w:r>
+            <w:proofErr w:type="spellEnd"/>
+            <w:r>
+              <w:rPr>
+                <w:b/>
+                <w:bCs/>
+              </w:rPr>
+              <w:t xml:space="preserve"> </w:t>
+            </w:r>
+            <w:proofErr w:type="spellStart"/>
+            <w:r>
+              <w:rPr>
+                <w:b/>
+                <w:bCs/>
+              </w:rPr>
+              <w:t>im</w:t>
+            </w:r>
+            <w:proofErr w:type="spellEnd"/>
+            <w:r>
+              <w:rPr>
+                <w:b/>
+                <w:bCs/>
+              </w:rPr>
+              <w:t xml:space="preserve"> </w:t>
+            </w:r>
+            <w:proofErr w:type="spellStart"/>
+            <w:r>
+              <w:rPr>
+                <w:b/>
+                <w:bCs/>
+              </w:rPr>
+              <w:t>Dativ</w:t>
+            </w:r>
+            <w:proofErr w:type="spellEnd"/>
           </w:p>
         </w:tc>
       </w:tr>
@@ -1232,6 +1620,10 @@
     <w:p>
       <w:pPr>
         <w:pStyle w:val="ListParagraph"/>
+        <w:numPr>
+          <w:ilvl w:val="0"/>
+          <w:numId w:val="1"/>
+        </w:numPr>
       </w:pPr>
     </w:p>
     <w:sectPr>
@@ -1249,7 +1641,7 @@
   <w:abstractNum w:abstractNumId="0" w15:restartNumberingAfterBreak="0">
     <w:nsid w:val="487A28FA"/>
     <w:multiLevelType w:val="hybridMultilevel"/>
-    <w:tmpl w:val="915E712A"/>
+    <w:tmpl w:val="594652A0"/>
     <w:lvl w:ilvl="0" w:tplc="0C090001">
       <w:start w:val="1"/>
       <w:numFmt w:val="bullet"/>
@@ -1967,6 +2359,7 @@
   <w:style w:type="character" w:default="1" w:styleId="DefaultParagraphFont">
     <w:name w:val="Default Paragraph Font"/>
     <w:uiPriority w:val="1"/>
+    <w:semiHidden/>
     <w:unhideWhenUsed/>
   </w:style>
   <w:style w:type="table" w:default="1" w:styleId="TableNormal">

</xml_diff>